<commit_message>
Fix assessment page order
</commit_message>
<xml_diff>
--- a/Assessments/Answer to PP Assessment - Microsoft Certified Azure AI Engineer Associate AI-102 Training - v1.0.docx
+++ b/Assessments/Answer to PP Assessment - Microsoft Certified Azure AI Engineer Associate AI-102 Training - v1.0.docx
@@ -250,224 +250,6 @@
           <w:sz w:val="20"/>
         </w:rPr>
         <w:t>Version v1.0</w:t>
-      </w:r>
-    </w:p>
-    <w:p>
-      <w:r>
-        <w:br w:type="page"/>
-      </w:r>
-    </w:p>
-    <w:p>
-      <w:pPr>
-        <w:spacing w:after="360"/>
-      </w:pPr>
-      <w:r>
-        <w:rPr>
-          <w:rFonts w:ascii="Arial" w:hAnsi="Arial"/>
-          <w:b/>
-          <w:i w:val="0"/>
-          <w:color w:val="4B5563"/>
-          <w:sz w:val="21"/>
-        </w:rPr>
-        <w:t>ANSWER TO PRACTICAL PERFORMANCE ASSESSMENT</w:t>
-      </w:r>
-      <w:r>
-        <w:rPr>
-          <w:rFonts w:ascii="Arial" w:hAnsi="Arial"/>
-          <w:b/>
-          <w:i w:val="0"/>
-          <w:color w:val="111827"/>
-          <w:sz w:val="21"/>
-        </w:rPr>
-        <w:t xml:space="preserve">  |  </w:t>
-      </w:r>
-      <w:r>
-        <w:rPr>
-          <w:rFonts w:ascii="Arial" w:hAnsi="Arial"/>
-          <w:b w:val="0"/>
-          <w:i w:val="0"/>
-          <w:color w:val="4B5563"/>
-          <w:sz w:val="21"/>
-        </w:rPr>
-        <w:t>Microsoft Certified Azure AI Engineer Associate AI-102 Training</w:t>
-      </w:r>
-    </w:p>
-    <w:p>
-      <w:pPr>
-        <w:spacing w:before="0" w:after="160"/>
-        <w:pBdr>
-          <w:bottom w:val="single" w:sz="6" w:space="4" w:color="D9E2F0"/>
-        </w:pBdr>
-      </w:pPr>
-      <w:r>
-        <w:rPr>
-          <w:rFonts w:ascii="Arial" w:hAnsi="Arial"/>
-          <w:b/>
-          <w:i w:val="0"/>
-          <w:color w:val="111827"/>
-          <w:sz w:val="32"/>
-        </w:rPr>
-        <w:t>TABLE OF CONTENTS</w:t>
-      </w:r>
-    </w:p>
-    <w:p>
-      <w:pPr>
-        <w:tabs>
-          <w:tab w:pos="8928" w:val="right" w:leader="dot"/>
-        </w:tabs>
-        <w:spacing w:after="140"/>
-        <w:ind w:left="0"/>
-      </w:pPr>
-      <w:r>
-        <w:rPr>
-          <w:rFonts w:ascii="Arial" w:hAnsi="Arial"/>
-          <w:b/>
-          <w:i w:val="0"/>
-          <w:color w:val="111827"/>
-          <w:sz w:val="22"/>
-        </w:rPr>
-        <w:t>Answer to Practical Performance Assessment (Marking Guide)</w:t>
-      </w:r>
-      <w:r>
-        <w:tab/>
-      </w:r>
-      <w:r>
-        <w:rPr>
-          <w:rFonts w:ascii="Arial" w:hAnsi="Arial"/>
-          <w:b/>
-          <w:i w:val="0"/>
-          <w:color w:val="111827"/>
-          <w:sz w:val="22"/>
-        </w:rPr>
-        <w:t>3</w:t>
-      </w:r>
-    </w:p>
-    <w:p>
-      <w:pPr>
-        <w:tabs>
-          <w:tab w:pos="8928" w:val="right" w:leader="dot"/>
-        </w:tabs>
-        <w:spacing w:after="140"/>
-        <w:ind w:left="0"/>
-      </w:pPr>
-      <w:r>
-        <w:rPr>
-          <w:rFonts w:ascii="Arial" w:hAnsi="Arial"/>
-          <w:b/>
-          <w:i w:val="0"/>
-          <w:color w:val="111827"/>
-          <w:sz w:val="22"/>
-        </w:rPr>
-        <w:t>Assessment Alignment</w:t>
-      </w:r>
-      <w:r>
-        <w:tab/>
-      </w:r>
-      <w:r>
-        <w:rPr>
-          <w:rFonts w:ascii="Arial" w:hAnsi="Arial"/>
-          <w:b/>
-          <w:i w:val="0"/>
-          <w:color w:val="111827"/>
-          <w:sz w:val="22"/>
-        </w:rPr>
-        <w:t>3</w:t>
-      </w:r>
-    </w:p>
-    <w:p>
-      <w:pPr>
-        <w:tabs>
-          <w:tab w:pos="8928" w:val="right" w:leader="dot"/>
-        </w:tabs>
-        <w:spacing w:after="140"/>
-        <w:ind w:left="0"/>
-      </w:pPr>
-      <w:r>
-        <w:rPr>
-          <w:rFonts w:ascii="Arial" w:hAnsi="Arial"/>
-          <w:b/>
-          <w:i w:val="0"/>
-          <w:color w:val="111827"/>
-          <w:sz w:val="22"/>
-        </w:rPr>
-        <w:t>Model Practical Evidence</w:t>
-      </w:r>
-      <w:r>
-        <w:tab/>
-      </w:r>
-      <w:r>
-        <w:rPr>
-          <w:rFonts w:ascii="Arial" w:hAnsi="Arial"/>
-          <w:b/>
-          <w:i w:val="0"/>
-          <w:color w:val="111827"/>
-          <w:sz w:val="22"/>
-        </w:rPr>
-        <w:t>4</w:t>
-      </w:r>
-    </w:p>
-    <w:p>
-      <w:pPr>
-        <w:tabs>
-          <w:tab w:pos="8928" w:val="right" w:leader="dot"/>
-        </w:tabs>
-        <w:spacing w:after="100"/>
-        <w:ind w:left="312"/>
-      </w:pPr>
-      <w:r>
-        <w:rPr>
-          <w:rFonts w:ascii="Arial" w:hAnsi="Arial"/>
-          <w:b w:val="0"/>
-          <w:i w:val="0"/>
-          <w:color w:val="4B5563"/>
-          <w:sz w:val="20"/>
-        </w:rPr>
-        <w:t>Tasks 1-5</w:t>
-      </w:r>
-      <w:r>
-        <w:tab/>
-      </w:r>
-      <w:r>
-        <w:rPr>
-          <w:rFonts w:ascii="Arial" w:hAnsi="Arial"/>
-          <w:b w:val="0"/>
-          <w:i w:val="0"/>
-          <w:color w:val="111827"/>
-          <w:sz w:val="20"/>
-        </w:rPr>
-        <w:t>4</w:t>
-      </w:r>
-    </w:p>
-    <w:p>
-      <w:pPr>
-        <w:tabs>
-          <w:tab w:pos="8928" w:val="right" w:leader="dot"/>
-        </w:tabs>
-        <w:spacing w:after="100"/>
-        <w:ind w:left="312"/>
-      </w:pPr>
-      <w:r>
-        <w:rPr>
-          <w:rFonts w:ascii="Arial" w:hAnsi="Arial"/>
-          <w:b w:val="0"/>
-          <w:i w:val="0"/>
-          <w:color w:val="4B5563"/>
-          <w:sz w:val="20"/>
-        </w:rPr>
-        <w:t>Tasks 6-10</w:t>
-      </w:r>
-      <w:r>
-        <w:tab/>
-      </w:r>
-      <w:r>
-        <w:rPr>
-          <w:rFonts w:ascii="Arial" w:hAnsi="Arial"/>
-          <w:b w:val="0"/>
-          <w:i w:val="0"/>
-          <w:color w:val="111827"/>
-          <w:sz w:val="20"/>
-        </w:rPr>
-        <w:t>7</w:t>
       </w:r>
     </w:p>
     <w:p>

</xml_diff>